<commit_message>
Add dynamic elements, modified selectors, and timed form confirmation"
</commit_message>
<xml_diff>
--- a/Starter Files/Week 1/PA Starter Files_Updating Alerts/Performance Assessment Report.docx
+++ b/Starter Files/Week 1/PA Starter Files_Updating Alerts/Performance Assessment Report.docx
@@ -116,131 +116,15 @@
         <w:t xml:space="preserve"> Be sure to include your computer system date and time.</w:t>
       </w:r>
     </w:p>
-    <w:p>
-      <w:r>
-        <w:drawing>
-          <wp:inline distT="0" distB="0" distL="0" distR="0" wp14:anchorId="3B18A22B" wp14:editId="0CA40C87">
-            <wp:extent cx="5852160" cy="3474720"/>
-            <wp:effectExtent l="0" t="0" r="0" b="0"/>
-            <wp:docPr id="533853122" name="Picture 1"/>
-            <wp:cNvGraphicFramePr>
-              <a:graphicFrameLocks xmlns:a="http://schemas.openxmlformats.org/drawingml/2006/main" noChangeAspect="1"/>
-            </wp:cNvGraphicFramePr>
-            <a:graphic xmlns:a="http://schemas.openxmlformats.org/drawingml/2006/main">
-              <a:graphicData uri="http://schemas.openxmlformats.org/drawingml/2006/picture">
-                <pic:pic xmlns:pic="http://schemas.openxmlformats.org/drawingml/2006/picture">
-                  <pic:nvPicPr>
-                    <pic:cNvPr id="533853122" name=""/>
-                    <pic:cNvPicPr/>
-                  </pic:nvPicPr>
-                  <pic:blipFill>
-                    <a:blip r:embed="rId10"/>
-                    <a:stretch>
-                      <a:fillRect/>
-                    </a:stretch>
-                  </pic:blipFill>
-                  <pic:spPr>
-                    <a:xfrm>
-                      <a:off x="0" y="0"/>
-                      <a:ext cx="5852160" cy="3474720"/>
-                    </a:xfrm>
-                    <a:prstGeom prst="rect">
-                      <a:avLst/>
-                    </a:prstGeom>
-                  </pic:spPr>
-                </pic:pic>
-              </a:graphicData>
-            </a:graphic>
-          </wp:inline>
-        </w:drawing>
-      </w:r>
-    </w:p>
-    <w:p>
-      <w:r>
-        <w:lastRenderedPageBreak/>
-        <w:drawing>
-          <wp:inline distT="0" distB="0" distL="0" distR="0" wp14:anchorId="06F007AE" wp14:editId="181A5182">
-            <wp:extent cx="5852160" cy="3474720"/>
-            <wp:effectExtent l="0" t="0" r="0" b="0"/>
-            <wp:docPr id="2039465678" name="Picture 1"/>
-            <wp:cNvGraphicFramePr>
-              <a:graphicFrameLocks xmlns:a="http://schemas.openxmlformats.org/drawingml/2006/main" noChangeAspect="1"/>
-            </wp:cNvGraphicFramePr>
-            <a:graphic xmlns:a="http://schemas.openxmlformats.org/drawingml/2006/main">
-              <a:graphicData uri="http://schemas.openxmlformats.org/drawingml/2006/picture">
-                <pic:pic xmlns:pic="http://schemas.openxmlformats.org/drawingml/2006/picture">
-                  <pic:nvPicPr>
-                    <pic:cNvPr id="2039465678" name=""/>
-                    <pic:cNvPicPr/>
-                  </pic:nvPicPr>
-                  <pic:blipFill>
-                    <a:blip r:embed="rId11"/>
-                    <a:stretch>
-                      <a:fillRect/>
-                    </a:stretch>
-                  </pic:blipFill>
-                  <pic:spPr>
-                    <a:xfrm>
-                      <a:off x="0" y="0"/>
-                      <a:ext cx="5852160" cy="3474720"/>
-                    </a:xfrm>
-                    <a:prstGeom prst="rect">
-                      <a:avLst/>
-                    </a:prstGeom>
-                  </pic:spPr>
-                </pic:pic>
-              </a:graphicData>
-            </a:graphic>
-          </wp:inline>
-        </w:drawing>
-      </w:r>
-    </w:p>
-    <w:p>
-      <w:r>
-        <w:drawing>
-          <wp:inline distT="0" distB="0" distL="0" distR="0" wp14:anchorId="492832F8" wp14:editId="25AEBE7E">
-            <wp:extent cx="5852160" cy="3474720"/>
-            <wp:effectExtent l="0" t="0" r="0" b="0"/>
-            <wp:docPr id="156141175" name="Picture 1"/>
-            <wp:cNvGraphicFramePr>
-              <a:graphicFrameLocks xmlns:a="http://schemas.openxmlformats.org/drawingml/2006/main" noChangeAspect="1"/>
-            </wp:cNvGraphicFramePr>
-            <a:graphic xmlns:a="http://schemas.openxmlformats.org/drawingml/2006/main">
-              <a:graphicData uri="http://schemas.openxmlformats.org/drawingml/2006/picture">
-                <pic:pic xmlns:pic="http://schemas.openxmlformats.org/drawingml/2006/picture">
-                  <pic:nvPicPr>
-                    <pic:cNvPr id="156141175" name=""/>
-                    <pic:cNvPicPr/>
-                  </pic:nvPicPr>
-                  <pic:blipFill>
-                    <a:blip r:embed="rId12"/>
-                    <a:stretch>
-                      <a:fillRect/>
-                    </a:stretch>
-                  </pic:blipFill>
-                  <pic:spPr>
-                    <a:xfrm>
-                      <a:off x="0" y="0"/>
-                      <a:ext cx="5852160" cy="3474720"/>
-                    </a:xfrm>
-                    <a:prstGeom prst="rect">
-                      <a:avLst/>
-                    </a:prstGeom>
-                  </pic:spPr>
-                </pic:pic>
-              </a:graphicData>
-            </a:graphic>
-          </wp:inline>
-        </w:drawing>
-      </w:r>
-    </w:p>
+    <w:p/>
+    <w:p/>
+    <w:p/>
     <w:p/>
     <w:p>
       <w:pPr>
         <w:pStyle w:val="Heading1"/>
       </w:pPr>
       <w:r>
-        <w:lastRenderedPageBreak/>
         <w:t>Code Screenshots</w:t>
       </w:r>
     </w:p>
@@ -312,11 +196,12 @@
         <w:rPr>
           <w:iCs/>
         </w:rPr>
+        <w:lastRenderedPageBreak/>
         <w:drawing>
-          <wp:inline distT="0" distB="0" distL="0" distR="0" wp14:anchorId="606FB841" wp14:editId="543A3EEE">
-            <wp:extent cx="5852160" cy="3145790"/>
+          <wp:inline distT="0" distB="0" distL="0" distR="0" wp14:anchorId="10C78ACD" wp14:editId="6528F715">
+            <wp:extent cx="5852160" cy="3657600"/>
             <wp:effectExtent l="0" t="0" r="0" b="0"/>
-            <wp:docPr id="1264247711" name="Picture 1"/>
+            <wp:docPr id="1905611538" name="Picture 1"/>
             <wp:cNvGraphicFramePr>
               <a:graphicFrameLocks xmlns:a="http://schemas.openxmlformats.org/drawingml/2006/main" noChangeAspect="1"/>
             </wp:cNvGraphicFramePr>
@@ -324,11 +209,11 @@
               <a:graphicData uri="http://schemas.openxmlformats.org/drawingml/2006/picture">
                 <pic:pic xmlns:pic="http://schemas.openxmlformats.org/drawingml/2006/picture">
                   <pic:nvPicPr>
-                    <pic:cNvPr id="1264247711" name=""/>
+                    <pic:cNvPr id="1905611538" name=""/>
                     <pic:cNvPicPr/>
                   </pic:nvPicPr>
                   <pic:blipFill>
-                    <a:blip r:embed="rId13"/>
+                    <a:blip r:embed="rId10"/>
                     <a:stretch>
                       <a:fillRect/>
                     </a:stretch>
@@ -336,7 +221,7 @@
                   <pic:spPr>
                     <a:xfrm>
                       <a:off x="0" y="0"/>
-                      <a:ext cx="5852160" cy="3145790"/>
+                      <a:ext cx="5852160" cy="3657600"/>
                     </a:xfrm>
                     <a:prstGeom prst="rect">
                       <a:avLst/>
@@ -360,10 +245,10 @@
           <w:iCs/>
         </w:rPr>
         <w:drawing>
-          <wp:inline distT="0" distB="0" distL="0" distR="0" wp14:anchorId="6261C856" wp14:editId="2156EB9A">
-            <wp:extent cx="5852160" cy="3145790"/>
+          <wp:inline distT="0" distB="0" distL="0" distR="0" wp14:anchorId="5BF0159E" wp14:editId="4BB209CC">
+            <wp:extent cx="5852160" cy="3657600"/>
             <wp:effectExtent l="0" t="0" r="0" b="0"/>
-            <wp:docPr id="497814188" name="Picture 1"/>
+            <wp:docPr id="1513529902" name="Picture 1"/>
             <wp:cNvGraphicFramePr>
               <a:graphicFrameLocks xmlns:a="http://schemas.openxmlformats.org/drawingml/2006/main" noChangeAspect="1"/>
             </wp:cNvGraphicFramePr>
@@ -371,11 +256,11 @@
               <a:graphicData uri="http://schemas.openxmlformats.org/drawingml/2006/picture">
                 <pic:pic xmlns:pic="http://schemas.openxmlformats.org/drawingml/2006/picture">
                   <pic:nvPicPr>
-                    <pic:cNvPr id="497814188" name=""/>
+                    <pic:cNvPr id="1513529902" name=""/>
                     <pic:cNvPicPr/>
                   </pic:nvPicPr>
                   <pic:blipFill>
-                    <a:blip r:embed="rId14"/>
+                    <a:blip r:embed="rId11"/>
                     <a:stretch>
                       <a:fillRect/>
                     </a:stretch>
@@ -383,7 +268,7 @@
                   <pic:spPr>
                     <a:xfrm>
                       <a:off x="0" y="0"/>
-                      <a:ext cx="5852160" cy="3145790"/>
+                      <a:ext cx="5852160" cy="3657600"/>
                     </a:xfrm>
                     <a:prstGeom prst="rect">
                       <a:avLst/>
@@ -408,10 +293,10 @@
         </w:rPr>
         <w:lastRenderedPageBreak/>
         <w:drawing>
-          <wp:inline distT="0" distB="0" distL="0" distR="0" wp14:anchorId="7CB21E51" wp14:editId="738F9BD0">
-            <wp:extent cx="5852160" cy="3145790"/>
+          <wp:inline distT="0" distB="0" distL="0" distR="0" wp14:anchorId="50C4E591" wp14:editId="04D80CEF">
+            <wp:extent cx="5852160" cy="3657600"/>
             <wp:effectExtent l="0" t="0" r="0" b="0"/>
-            <wp:docPr id="1218265913" name="Picture 1"/>
+            <wp:docPr id="1421674365" name="Picture 1"/>
             <wp:cNvGraphicFramePr>
               <a:graphicFrameLocks xmlns:a="http://schemas.openxmlformats.org/drawingml/2006/main" noChangeAspect="1"/>
             </wp:cNvGraphicFramePr>
@@ -419,11 +304,11 @@
               <a:graphicData uri="http://schemas.openxmlformats.org/drawingml/2006/picture">
                 <pic:pic xmlns:pic="http://schemas.openxmlformats.org/drawingml/2006/picture">
                   <pic:nvPicPr>
-                    <pic:cNvPr id="1218265913" name=""/>
+                    <pic:cNvPr id="1421674365" name=""/>
                     <pic:cNvPicPr/>
                   </pic:nvPicPr>
                   <pic:blipFill>
-                    <a:blip r:embed="rId15"/>
+                    <a:blip r:embed="rId12"/>
                     <a:stretch>
                       <a:fillRect/>
                     </a:stretch>
@@ -431,7 +316,54 @@
                   <pic:spPr>
                     <a:xfrm>
                       <a:off x="0" y="0"/>
-                      <a:ext cx="5852160" cy="3145790"/>
+                      <a:ext cx="5852160" cy="3657600"/>
+                    </a:xfrm>
+                    <a:prstGeom prst="rect">
+                      <a:avLst/>
+                    </a:prstGeom>
+                  </pic:spPr>
+                </pic:pic>
+              </a:graphicData>
+            </a:graphic>
+          </wp:inline>
+        </w:drawing>
+      </w:r>
+    </w:p>
+    <w:p>
+      <w:pPr>
+        <w:rPr>
+          <w:iCs/>
+        </w:rPr>
+      </w:pPr>
+      <w:r>
+        <w:rPr>
+          <w:iCs/>
+        </w:rPr>
+        <w:drawing>
+          <wp:inline distT="0" distB="0" distL="0" distR="0" wp14:anchorId="005F32C1" wp14:editId="49291AB4">
+            <wp:extent cx="5852160" cy="3657600"/>
+            <wp:effectExtent l="0" t="0" r="0" b="0"/>
+            <wp:docPr id="1767109086" name="Picture 1"/>
+            <wp:cNvGraphicFramePr>
+              <a:graphicFrameLocks xmlns:a="http://schemas.openxmlformats.org/drawingml/2006/main" noChangeAspect="1"/>
+            </wp:cNvGraphicFramePr>
+            <a:graphic xmlns:a="http://schemas.openxmlformats.org/drawingml/2006/main">
+              <a:graphicData uri="http://schemas.openxmlformats.org/drawingml/2006/picture">
+                <pic:pic xmlns:pic="http://schemas.openxmlformats.org/drawingml/2006/picture">
+                  <pic:nvPicPr>
+                    <pic:cNvPr id="1767109086" name=""/>
+                    <pic:cNvPicPr/>
+                  </pic:nvPicPr>
+                  <pic:blipFill>
+                    <a:blip r:embed="rId13"/>
+                    <a:stretch>
+                      <a:fillRect/>
+                    </a:stretch>
+                  </pic:blipFill>
+                  <pic:spPr>
+                    <a:xfrm>
+                      <a:off x="0" y="0"/>
+                      <a:ext cx="5852160" cy="3657600"/>
                     </a:xfrm>
                     <a:prstGeom prst="rect">
                       <a:avLst/>
@@ -445,12 +377,12 @@
       </w:r>
     </w:p>
     <w:sectPr>
-      <w:headerReference w:type="even" r:id="rId16"/>
-      <w:headerReference w:type="default" r:id="rId17"/>
-      <w:footerReference w:type="even" r:id="rId18"/>
-      <w:footerReference w:type="default" r:id="rId19"/>
-      <w:headerReference w:type="first" r:id="rId20"/>
-      <w:footerReference w:type="first" r:id="rId21"/>
+      <w:headerReference w:type="even" r:id="rId14"/>
+      <w:headerReference w:type="default" r:id="rId15"/>
+      <w:footerReference w:type="even" r:id="rId16"/>
+      <w:footerReference w:type="default" r:id="rId17"/>
+      <w:headerReference w:type="first" r:id="rId18"/>
+      <w:footerReference w:type="first" r:id="rId19"/>
       <w:pgSz w:w="12240" w:h="15840" w:code="1"/>
       <w:pgMar w:top="1440" w:right="1440" w:bottom="1440" w:left="1440" w:header="1440" w:footer="1440" w:gutter="144"/>
       <w:cols w:space="720"/>
@@ -5019,18 +4951,6 @@
 </file>
 
 <file path=customXml/item2.xml><?xml version="1.0" encoding="utf-8"?>
-<p:properties xmlns:p="http://schemas.microsoft.com/office/2006/metadata/properties" xmlns:xsi="http://www.w3.org/2001/XMLSchema-instance" xmlns:pc="http://schemas.microsoft.com/office/infopath/2007/PartnerControls">
-  <documentManagement>
-    <Preview xmlns="c6c77d8f-09f6-4e2b-8f47-31ad1c0144f5" xsi:nil="true"/>
-    <lcf76f155ced4ddcb4097134ff3c332f xmlns="c6c77d8f-09f6-4e2b-8f47-31ad1c0144f5">
-      <Terms xmlns="http://schemas.microsoft.com/office/infopath/2007/PartnerControls"/>
-    </lcf76f155ced4ddcb4097134ff3c332f>
-    <TaxCatchAll xmlns="146bd9e1-3fdb-4f50-9526-c68c2343cb8e" xsi:nil="true"/>
-  </documentManagement>
-</p:properties>
-</file>
-
-<file path=customXml/item3.xml><?xml version="1.0" encoding="utf-8"?>
 <ct:contentTypeSchema xmlns:ct="http://schemas.microsoft.com/office/2006/metadata/contentType" xmlns:ma="http://schemas.microsoft.com/office/2006/metadata/properties/metaAttributes" ct:_="" ma:_="" ma:contentTypeName="Document" ma:contentTypeID="0x0101009773663AEC73F64CB9310C74F592BBA1" ma:contentTypeVersion="20" ma:contentTypeDescription="Create a new document." ma:contentTypeScope="" ma:versionID="c4ee6c6961591c1a63add96d4ce05241">
   <xsd:schema xmlns:xsd="http://www.w3.org/2001/XMLSchema" xmlns:xs="http://www.w3.org/2001/XMLSchema" xmlns:p="http://schemas.microsoft.com/office/2006/metadata/properties" xmlns:ns2="c6c77d8f-09f6-4e2b-8f47-31ad1c0144f5" xmlns:ns3="146bd9e1-3fdb-4f50-9526-c68c2343cb8e" targetNamespace="http://schemas.microsoft.com/office/2006/metadata/properties" ma:root="true" ma:fieldsID="b2274d1538facf08196bf05114238597" ns2:_="" ns3:_="">
     <xsd:import namespace="c6c77d8f-09f6-4e2b-8f47-31ad1c0144f5"/>
@@ -5297,6 +5217,18 @@
 </ct:contentTypeSchema>
 </file>
 
+<file path=customXml/item3.xml><?xml version="1.0" encoding="utf-8"?>
+<p:properties xmlns:p="http://schemas.microsoft.com/office/2006/metadata/properties" xmlns:xsi="http://www.w3.org/2001/XMLSchema-instance" xmlns:pc="http://schemas.microsoft.com/office/infopath/2007/PartnerControls">
+  <documentManagement>
+    <Preview xmlns="c6c77d8f-09f6-4e2b-8f47-31ad1c0144f5" xsi:nil="true"/>
+    <lcf76f155ced4ddcb4097134ff3c332f xmlns="c6c77d8f-09f6-4e2b-8f47-31ad1c0144f5">
+      <Terms xmlns="http://schemas.microsoft.com/office/infopath/2007/PartnerControls"/>
+    </lcf76f155ced4ddcb4097134ff3c332f>
+    <TaxCatchAll xmlns="146bd9e1-3fdb-4f50-9526-c68c2343cb8e" xsi:nil="true"/>
+  </documentManagement>
+</p:properties>
+</file>
+
 <file path=customXml/itemProps1.xml><?xml version="1.0" encoding="utf-8"?>
 <ds:datastoreItem xmlns:ds="http://schemas.openxmlformats.org/officeDocument/2006/customXml" ds:itemID="{77991735-DCD3-45B1-A011-77EB6015DA17}">
   <ds:schemaRefs>
@@ -5306,17 +5238,6 @@
 </file>
 
 <file path=customXml/itemProps2.xml><?xml version="1.0" encoding="utf-8"?>
-<ds:datastoreItem xmlns:ds="http://schemas.openxmlformats.org/officeDocument/2006/customXml" ds:itemID="{0BF1CE46-C6C6-4A06-ACD6-BFE7A5A034B4}">
-  <ds:schemaRefs>
-    <ds:schemaRef ds:uri="http://schemas.microsoft.com/office/2006/metadata/properties"/>
-    <ds:schemaRef ds:uri="http://schemas.microsoft.com/office/infopath/2007/PartnerControls"/>
-    <ds:schemaRef ds:uri="c6c77d8f-09f6-4e2b-8f47-31ad1c0144f5"/>
-    <ds:schemaRef ds:uri="146bd9e1-3fdb-4f50-9526-c68c2343cb8e"/>
-  </ds:schemaRefs>
-</ds:datastoreItem>
-</file>
-
-<file path=customXml/itemProps3.xml><?xml version="1.0" encoding="utf-8"?>
 <ds:datastoreItem xmlns:ds="http://schemas.openxmlformats.org/officeDocument/2006/customXml" ds:itemID="{DC26566C-B70D-434F-8BEF-49A0D689C436}">
   <ds:schemaRefs>
     <ds:schemaRef ds:uri="http://schemas.microsoft.com/office/2006/metadata/contentType"/>
@@ -5335,6 +5256,17 @@
 </ds:datastoreItem>
 </file>
 
+<file path=customXml/itemProps3.xml><?xml version="1.0" encoding="utf-8"?>
+<ds:datastoreItem xmlns:ds="http://schemas.openxmlformats.org/officeDocument/2006/customXml" ds:itemID="{0BF1CE46-C6C6-4A06-ACD6-BFE7A5A034B4}">
+  <ds:schemaRefs>
+    <ds:schemaRef ds:uri="http://schemas.microsoft.com/office/2006/metadata/properties"/>
+    <ds:schemaRef ds:uri="http://schemas.microsoft.com/office/infopath/2007/PartnerControls"/>
+    <ds:schemaRef ds:uri="c6c77d8f-09f6-4e2b-8f47-31ad1c0144f5"/>
+    <ds:schemaRef ds:uri="146bd9e1-3fdb-4f50-9526-c68c2343cb8e"/>
+  </ds:schemaRefs>
+</ds:datastoreItem>
+</file>
+
 <file path=docMetadata/LabelInfo.xml><?xml version="1.0" encoding="utf-8"?>
 <clbl:labelList xmlns:clbl="http://schemas.microsoft.com/office/2020/mipLabelMetadata">
   <clbl:label id="{50656f6f-463c-4054-9fc2-6f4071c6e7fc}" enabled="0" method="" siteId="{50656f6f-463c-4054-9fc2-6f4071c6e7fc}" removed="1"/>

</xml_diff>